<commit_message>
explainer short letter alignmen fixed
</commit_message>
<xml_diff>
--- a/Explainer_SHORT_LETTER.docx
+++ b/Explainer_SHORT_LETTER.docx
@@ -5,6 +5,7 @@
     <w:p>
       <w:pPr>
         <w:spacing w:after="20"/>
+        <w:ind w:left="426"/>
         <w:rPr>
           <w:b/>
           <w:bCs/>
@@ -16,6 +17,7 @@
     <w:p>
       <w:pPr>
         <w:spacing w:after="20"/>
+        <w:ind w:left="426"/>
         <w:rPr>
           <w:b/>
           <w:spacing w:val="-5"/>
@@ -135,6 +137,7 @@
     <w:p>
       <w:pPr>
         <w:spacing w:after="20"/>
+        <w:ind w:left="426"/>
         <w:rPr>
           <w:b/>
           <w:bCs/>
@@ -146,6 +149,7 @@
     <w:p>
       <w:pPr>
         <w:spacing w:after="20"/>
+        <w:ind w:left="426"/>
         <w:rPr>
           <w:b/>
           <w:bCs/>
@@ -181,13 +185,12 @@
         </w:rPr>
         <w:t>Labour</w:t>
       </w:r>
-      <w:bookmarkStart w:id="0" w:name="_GoBack"/>
-      <w:bookmarkEnd w:id="0"/>
       <w:proofErr w:type="spellEnd"/>
     </w:p>
     <w:tbl>
       <w:tblPr>
-        <w:tblW w:w="10346" w:type="dxa"/>
+        <w:tblW w:w="9922" w:type="dxa"/>
+        <w:tblInd w:w="424" w:type="dxa"/>
         <w:tblBorders>
           <w:top w:val="single" w:sz="4" w:space="0" w:color="auto"/>
           <w:left w:val="single" w:sz="4" w:space="0" w:color="auto"/>
@@ -203,12 +206,12 @@
         <w:tblLook w:val="04A0" w:firstRow="1" w:lastRow="0" w:firstColumn="1" w:lastColumn="0" w:noHBand="0" w:noVBand="1"/>
       </w:tblPr>
       <w:tblGrid>
-        <w:gridCol w:w="10346"/>
+        <w:gridCol w:w="9922"/>
       </w:tblGrid>
       <w:tr>
         <w:tc>
           <w:tcPr>
-            <w:tcW w:w="10346" w:type="dxa"/>
+            <w:tcW w:w="9922" w:type="dxa"/>
             <w:shd w:val="clear" w:color="auto" w:fill="F2F2F2"/>
             <w:tcMar>
               <w:top w:w="90" w:type="dxa"/>
@@ -220,31 +223,19 @@
           <w:p>
             <w:pPr>
               <w:spacing w:after="20"/>
+              <w:ind w:left="426"/>
             </w:pPr>
             <w:r>
               <w:rPr>
                 <w:b/>
                 <w:bCs/>
               </w:rPr>
-              <w:t xml:space="preserve">Re: Confirmation of Asylum Seeker Status and Right to Work Pending </w:t>
-            </w:r>
-            <w:r>
-              <w:rPr>
-                <w:b/>
-                <w:bCs/>
-              </w:rPr>
-              <w:t>Finalization</w:t>
-            </w:r>
-            <w:r>
-              <w:rPr>
-                <w:b/>
-                <w:bCs/>
-              </w:rPr>
-              <w:t xml:space="preserve"> of Application</w:t>
+              <w:t>Re: Confirmation of Asylum Seeker Status and Right to Work Pending Finalization of Application</w:t>
             </w:r>
           </w:p>
           <w:p>
             <w:pPr>
+              <w:ind w:left="426"/>
               <w:rPr>
                 <w:sz w:val="24"/>
                 <w:szCs w:val="24"/>
@@ -264,6 +255,7 @@
     <w:p>
       <w:pPr>
         <w:spacing w:after="80"/>
+        <w:ind w:left="426"/>
         <w:jc w:val="both"/>
         <w:rPr>
           <w:sz w:val="24"/>
@@ -281,6 +273,7 @@
     <w:p>
       <w:pPr>
         <w:spacing w:after="80"/>
+        <w:ind w:left="426"/>
         <w:jc w:val="both"/>
         <w:rPr>
           <w:sz w:val="24"/>
@@ -291,6 +284,7 @@
     <w:p>
       <w:pPr>
         <w:spacing w:after="80"/>
+        <w:ind w:left="426"/>
         <w:jc w:val="both"/>
         <w:rPr>
           <w:sz w:val="24"/>
@@ -339,6 +333,7 @@
     <w:p>
       <w:pPr>
         <w:spacing w:before="140" w:after="60"/>
+        <w:ind w:left="426"/>
         <w:rPr>
           <w:b/>
           <w:bCs/>
@@ -351,6 +346,7 @@
     <w:p>
       <w:pPr>
         <w:spacing w:before="140" w:after="60"/>
+        <w:ind w:left="426"/>
         <w:rPr>
           <w:sz w:val="24"/>
           <w:szCs w:val="24"/>
@@ -370,6 +366,7 @@
     <w:p>
       <w:pPr>
         <w:spacing w:after="80"/>
+        <w:ind w:left="426"/>
         <w:jc w:val="both"/>
       </w:pPr>
       <w:r>
@@ -379,7 +376,7 @@
     <w:p>
       <w:pPr>
         <w:spacing w:after="40"/>
-        <w:ind w:left="260" w:hanging="200"/>
+        <w:ind w:left="426" w:hanging="200"/>
       </w:pPr>
       <w:r>
         <w:rPr>
@@ -400,7 +397,7 @@
     <w:p>
       <w:pPr>
         <w:spacing w:after="40"/>
-        <w:ind w:left="260" w:hanging="200"/>
+        <w:ind w:left="426" w:hanging="200"/>
       </w:pPr>
       <w:r>
         <w:rPr>
@@ -421,7 +418,7 @@
     <w:p>
       <w:pPr>
         <w:spacing w:after="40"/>
-        <w:ind w:left="260" w:hanging="200"/>
+        <w:ind w:left="426" w:hanging="200"/>
       </w:pPr>
       <w:r>
         <w:rPr>
@@ -437,7 +434,7 @@
     <w:p>
       <w:pPr>
         <w:spacing w:after="40"/>
-        <w:ind w:left="260" w:hanging="200"/>
+        <w:ind w:left="426" w:hanging="200"/>
       </w:pPr>
       <w:r>
         <w:rPr>
@@ -461,6 +458,7 @@
     <w:p>
       <w:pPr>
         <w:spacing w:before="140" w:after="60"/>
+        <w:ind w:left="426"/>
         <w:rPr>
           <w:b/>
           <w:bCs/>
@@ -473,6 +471,7 @@
     <w:p>
       <w:pPr>
         <w:spacing w:before="140" w:after="60"/>
+        <w:ind w:left="426"/>
         <w:rPr>
           <w:sz w:val="24"/>
           <w:szCs w:val="24"/>
@@ -492,6 +491,7 @@
     <w:p>
       <w:pPr>
         <w:spacing w:after="80"/>
+        <w:ind w:left="426"/>
         <w:jc w:val="both"/>
       </w:pPr>
       <w:r>
@@ -501,7 +501,7 @@
     <w:p>
       <w:pPr>
         <w:spacing w:after="40"/>
-        <w:ind w:left="260" w:hanging="200"/>
+        <w:ind w:left="426" w:hanging="200"/>
       </w:pPr>
       <w:r>
         <w:rPr>
@@ -525,7 +525,7 @@
     <w:p>
       <w:pPr>
         <w:spacing w:after="40"/>
-        <w:ind w:left="260" w:hanging="200"/>
+        <w:ind w:left="426" w:hanging="200"/>
       </w:pPr>
       <w:r>
         <w:rPr>
@@ -549,41 +549,63 @@
     <w:p>
       <w:pPr>
         <w:spacing w:after="40"/>
-        <w:ind w:left="260" w:hanging="200"/>
-      </w:pPr>
-      <w:r>
+        <w:ind w:left="426" w:hanging="200"/>
         <w:rPr>
           <w:b/>
           <w:bCs/>
         </w:rPr>
-        <w:t xml:space="preserve">• </w:t>
-      </w:r>
-      <w:r>
-        <w:t xml:space="preserve">Section 22(1), Refugees Act 130 of 1998, read with Ahmed v Minister of Home Affairs [2018] ZACC 39: the Refugee Reception Officer must issue an asylum seeker visa pending the outcome of the application; this visa lawfully </w:t>
-      </w:r>
-      <w:proofErr w:type="spellStart"/>
-      <w:r>
-        <w:t>authorises</w:t>
-      </w:r>
-      <w:proofErr w:type="spellEnd"/>
-      <w:r>
-        <w:t xml:space="preserve"> the holder to sojourn and work in the Republic subject to its terms.</w:t>
-      </w:r>
+      </w:pPr>
     </w:p>
     <w:p>
       <w:pPr>
         <w:spacing w:after="40"/>
+        <w:ind w:left="426" w:hanging="200"/>
+        <w:rPr>
+          <w:b/>
+          <w:bCs/>
+        </w:rPr>
       </w:pPr>
     </w:p>
     <w:p>
       <w:pPr>
         <w:spacing w:after="40"/>
-        <w:ind w:left="260" w:hanging="200"/>
+        <w:ind w:left="426" w:hanging="200"/>
+      </w:pPr>
+      <w:r>
+        <w:rPr>
+          <w:b/>
+          <w:bCs/>
+        </w:rPr>
+        <w:t xml:space="preserve">• </w:t>
+      </w:r>
+      <w:r>
+        <w:t xml:space="preserve">Section 22(1), Refugees Act 130 of 1998, read with Ahmed v Minister of Home Affairs [2018] ZACC 39: the Refugee Reception Officer must issue an asylum seeker visa pending the outcome of the application; this visa lawfully </w:t>
+      </w:r>
+      <w:proofErr w:type="spellStart"/>
+      <w:r>
+        <w:t>authorises</w:t>
+      </w:r>
+      <w:proofErr w:type="spellEnd"/>
+      <w:r>
+        <w:t xml:space="preserve"> the holder to sojourn and work in the Republic subject to its terms.</w:t>
+      </w:r>
+    </w:p>
+    <w:p>
+      <w:pPr>
+        <w:spacing w:after="40"/>
+        <w:ind w:left="426"/>
+      </w:pPr>
+    </w:p>
+    <w:p>
+      <w:pPr>
+        <w:spacing w:after="40"/>
+        <w:ind w:left="426" w:hanging="200"/>
       </w:pPr>
     </w:p>
     <w:tbl>
       <w:tblPr>
-        <w:tblW w:w="10772" w:type="dxa"/>
+        <w:tblW w:w="10348" w:type="dxa"/>
+        <w:tblInd w:w="424" w:type="dxa"/>
         <w:tblBorders>
           <w:top w:val="single" w:sz="4" w:space="0" w:color="auto"/>
           <w:left w:val="single" w:sz="4" w:space="0" w:color="auto"/>
@@ -599,12 +621,12 @@
         <w:tblLook w:val="04A0" w:firstRow="1" w:lastRow="0" w:firstColumn="1" w:lastColumn="0" w:noHBand="0" w:noVBand="1"/>
       </w:tblPr>
       <w:tblGrid>
-        <w:gridCol w:w="10772"/>
+        <w:gridCol w:w="10348"/>
       </w:tblGrid>
       <w:tr>
         <w:tc>
           <w:tcPr>
-            <w:tcW w:w="10772" w:type="dxa"/>
+            <w:tcW w:w="10348" w:type="dxa"/>
             <w:shd w:val="clear" w:color="auto" w:fill="FBEAEA"/>
             <w:tcMar>
               <w:top w:w="90" w:type="dxa"/>
@@ -616,6 +638,7 @@
           <w:p>
             <w:pPr>
               <w:spacing w:after="30"/>
+              <w:ind w:left="426"/>
             </w:pPr>
             <w:r>
               <w:rPr>
@@ -629,6 +652,7 @@
           <w:p>
             <w:pPr>
               <w:spacing w:after="20"/>
+              <w:ind w:left="426"/>
               <w:rPr>
                 <w:sz w:val="24"/>
                 <w:szCs w:val="24"/>
@@ -658,6 +682,7 @@
     <w:p>
       <w:pPr>
         <w:spacing w:after="80"/>
+        <w:ind w:left="426"/>
         <w:jc w:val="both"/>
         <w:rPr>
           <w:sz w:val="24"/>
@@ -668,6 +693,7 @@
     <w:p>
       <w:pPr>
         <w:spacing w:after="80"/>
+        <w:ind w:left="426"/>
         <w:jc w:val="both"/>
         <w:rPr>
           <w:sz w:val="24"/>
@@ -701,31 +727,36 @@
     <w:p>
       <w:pPr>
         <w:spacing w:before="100" w:after="20"/>
-        <w:rPr>
-          <w:sz w:val="24"/>
-          <w:szCs w:val="24"/>
-        </w:rPr>
-      </w:pPr>
-      <w:r>
-        <w:rPr>
-          <w:sz w:val="24"/>
-          <w:szCs w:val="24"/>
-        </w:rPr>
-        <w:t>Kind Regards,</w:t>
-      </w:r>
+        <w:ind w:left="426"/>
+        <w:rPr>
+          <w:sz w:val="24"/>
+          <w:szCs w:val="24"/>
+        </w:rPr>
+      </w:pPr>
     </w:p>
     <w:p>
       <w:pPr>
         <w:spacing w:before="100" w:after="20"/>
-        <w:rPr>
-          <w:sz w:val="24"/>
-          <w:szCs w:val="24"/>
-        </w:rPr>
-      </w:pPr>
+        <w:ind w:left="426"/>
+        <w:rPr>
+          <w:sz w:val="24"/>
+          <w:szCs w:val="24"/>
+        </w:rPr>
+      </w:pPr>
+      <w:bookmarkStart w:id="0" w:name="_GoBack"/>
+      <w:bookmarkEnd w:id="0"/>
+      <w:r>
+        <w:rPr>
+          <w:sz w:val="24"/>
+          <w:szCs w:val="24"/>
+        </w:rPr>
+        <w:t>Kind Regards,</w:t>
+      </w:r>
     </w:p>
     <w:p>
       <w:pPr>
         <w:spacing w:before="100" w:after="20"/>
+        <w:ind w:left="426"/>
         <w:rPr>
           <w:sz w:val="24"/>
           <w:szCs w:val="24"/>
@@ -735,6 +766,7 @@
     <w:p>
       <w:pPr>
         <w:spacing w:before="100" w:after="20"/>
+        <w:ind w:left="426"/>
         <w:rPr>
           <w:sz w:val="24"/>
           <w:szCs w:val="24"/>
@@ -744,6 +776,7 @@
     <w:p>
       <w:pPr>
         <w:spacing w:before="100" w:after="20"/>
+        <w:ind w:left="426"/>
         <w:rPr>
           <w:sz w:val="24"/>
           <w:szCs w:val="24"/>
@@ -753,6 +786,17 @@
     <w:p>
       <w:pPr>
         <w:spacing w:before="100" w:after="20"/>
+        <w:ind w:left="426"/>
+        <w:rPr>
+          <w:sz w:val="24"/>
+          <w:szCs w:val="24"/>
+        </w:rPr>
+      </w:pPr>
+    </w:p>
+    <w:p>
+      <w:pPr>
+        <w:spacing w:before="100" w:after="20"/>
+        <w:ind w:left="426"/>
         <w:rPr>
           <w:sz w:val="24"/>
           <w:szCs w:val="24"/>
@@ -771,6 +815,7 @@
     <w:p>
       <w:pPr>
         <w:spacing w:after="10"/>
+        <w:ind w:left="426"/>
         <w:rPr>
           <w:b/>
           <w:bCs/>
@@ -791,6 +836,7 @@
     <w:p>
       <w:pPr>
         <w:spacing w:after="10"/>
+        <w:ind w:left="426"/>
         <w:rPr>
           <w:sz w:val="24"/>
           <w:szCs w:val="24"/>
@@ -800,6 +846,7 @@
     <w:p>
       <w:pPr>
         <w:spacing w:after="100"/>
+        <w:ind w:left="426"/>
         <w:rPr>
           <w:sz w:val="24"/>
           <w:szCs w:val="24"/>
@@ -835,6 +882,7 @@
           <w:top w:val="single" w:sz="4" w:space="0" w:color="1F3864"/>
         </w:pBdr>
         <w:spacing w:before="60"/>
+        <w:ind w:left="426"/>
         <w:jc w:val="center"/>
         <w:rPr>
           <w:sz w:val="20"/>
@@ -868,12 +916,16 @@
         <w:t xml:space="preserve">  Office: 082 373 8415 / 064 126 3073 / 074 036 6127  |  rod@sami.co.za  |  www.sami.co.za</w:t>
       </w:r>
     </w:p>
-    <w:p/>
+    <w:p>
+      <w:pPr>
+        <w:ind w:left="426"/>
+      </w:pPr>
+    </w:p>
     <w:sectPr>
       <w:headerReference w:type="default" r:id="rId9"/>
       <w:footerReference w:type="default" r:id="rId10"/>
       <w:pgSz w:w="12240" w:h="15840"/>
-      <w:pgMar w:top="2340" w:right="720" w:bottom="1100" w:left="360" w:header="303" w:footer="907" w:gutter="0"/>
+      <w:pgMar w:top="2340" w:right="1041" w:bottom="1100" w:left="360" w:header="303" w:footer="907" w:gutter="0"/>
       <w:cols w:space="720"/>
     </w:sectPr>
   </w:body>
@@ -916,7 +968,7 @@
         <w:lang w:val="en-ZA" w:eastAsia="en-ZA"/>
       </w:rPr>
       <w:drawing>
-        <wp:anchor distT="0" distB="0" distL="0" distR="0" simplePos="0" relativeHeight="487226880" behindDoc="1" locked="0" layoutInCell="1" allowOverlap="1" wp14:anchorId="701DEDA3" wp14:editId="47326C91">
+        <wp:anchor distT="0" distB="0" distL="0" distR="0" simplePos="0" relativeHeight="487226880" behindDoc="1" locked="0" layoutInCell="1" allowOverlap="1" wp14:anchorId="0AB190C8" wp14:editId="590C001A">
           <wp:simplePos x="0" y="0"/>
           <wp:positionH relativeFrom="page">
             <wp:posOffset>2266314</wp:posOffset>
@@ -968,7 +1020,7 @@
       <mc:AlternateContent>
         <mc:Choice Requires="wps">
           <w:drawing>
-            <wp:anchor distT="0" distB="0" distL="0" distR="0" simplePos="0" relativeHeight="487227392" behindDoc="1" locked="0" layoutInCell="1" allowOverlap="1" wp14:anchorId="747BD54F" wp14:editId="4DB32159">
+            <wp:anchor distT="0" distB="0" distL="0" distR="0" simplePos="0" relativeHeight="487227392" behindDoc="1" locked="0" layoutInCell="1" allowOverlap="1" wp14:anchorId="3C6CCF2B" wp14:editId="355489C6">
               <wp:simplePos x="0" y="0"/>
               <wp:positionH relativeFrom="page">
                 <wp:posOffset>886764</wp:posOffset>
@@ -2204,7 +2256,7 @@
       <mc:AlternateContent>
         <mc:Choice Requires="wps">
           <w:drawing>
-            <wp:anchor distT="0" distB="0" distL="0" distR="0" simplePos="0" relativeHeight="487227904" behindDoc="1" locked="0" layoutInCell="1" allowOverlap="1" wp14:anchorId="6C1331AA" wp14:editId="37653AE6">
+            <wp:anchor distT="0" distB="0" distL="0" distR="0" simplePos="0" relativeHeight="487227904" behindDoc="1" locked="0" layoutInCell="1" allowOverlap="1" wp14:anchorId="07365304" wp14:editId="4A1B6B03">
               <wp:simplePos x="0" y="0"/>
               <wp:positionH relativeFrom="page">
                 <wp:posOffset>4500753</wp:posOffset>
@@ -3255,7 +3307,7 @@
         <w:lang w:val="en-ZA" w:eastAsia="en-ZA"/>
       </w:rPr>
       <w:drawing>
-        <wp:anchor distT="0" distB="0" distL="0" distR="0" simplePos="0" relativeHeight="487225856" behindDoc="1" locked="0" layoutInCell="1" allowOverlap="1" wp14:anchorId="6B39B2D2" wp14:editId="1F8E0F2A">
+        <wp:anchor distT="0" distB="0" distL="0" distR="0" simplePos="0" relativeHeight="487225856" behindDoc="1" locked="0" layoutInCell="1" allowOverlap="1" wp14:anchorId="744C93A2" wp14:editId="38C89E2B">
           <wp:simplePos x="0" y="0"/>
           <wp:positionH relativeFrom="page">
             <wp:posOffset>460375</wp:posOffset>
@@ -3307,7 +3359,7 @@
       <mc:AlternateContent>
         <mc:Choice Requires="wps">
           <w:drawing>
-            <wp:anchor distT="0" distB="0" distL="0" distR="0" simplePos="0" relativeHeight="487226368" behindDoc="1" locked="0" layoutInCell="1" allowOverlap="1" wp14:anchorId="27E86EE3" wp14:editId="1AF2CFE3">
+            <wp:anchor distT="0" distB="0" distL="0" distR="0" simplePos="0" relativeHeight="487226368" behindDoc="1" locked="0" layoutInCell="1" allowOverlap="1" wp14:anchorId="0368BC41" wp14:editId="640ABAEA">
               <wp:simplePos x="0" y="0"/>
               <wp:positionH relativeFrom="page">
                 <wp:posOffset>428625</wp:posOffset>
@@ -3369,7 +3421,7 @@
             </wp:anchor>
           </w:drawing>
         </mc:Choice>
-        <mc:Fallback xmlns:ve="http://schemas.openxmlformats.org/markup-compatibility/2006" xmlns:a="http://schemas.openxmlformats.org/drawingml/2006/main" xmlns:pic="http://schemas.openxmlformats.org/drawingml/2006/picture">
+        <mc:Fallback xmlns:pic="http://schemas.openxmlformats.org/drawingml/2006/picture" xmlns:a="http://schemas.openxmlformats.org/drawingml/2006/main" xmlns:ve="http://schemas.openxmlformats.org/markup-compatibility/2006">
           <w:pict>
             <v:line style="position:absolute;mso-position-horizontal-relative:page;mso-position-vertical-relative:page;z-index:-16090112" from="33.75pt,117.5pt" to="557.450pt,117.5pt" stroked="true" strokeweight=".527870pt" strokecolor="#000000">
               <v:stroke dashstyle="shortdash"/>
@@ -4534,7 +4586,7 @@
 </file>
 
 <file path=customXml/itemProps1.xml><?xml version="1.0" encoding="utf-8"?>
-<ds:datastoreItem xmlns:ds="http://schemas.openxmlformats.org/officeDocument/2006/customXml" ds:itemID="{98EA9147-6282-4E5A-A200-31A94A2DA17A}">
+<ds:datastoreItem xmlns:ds="http://schemas.openxmlformats.org/officeDocument/2006/customXml" ds:itemID="{161E57EA-C5E1-4104-B738-C8390BA6359A}">
   <ds:schemaRefs>
     <ds:schemaRef ds:uri="http://schemas.openxmlformats.org/officeDocument/2006/bibliography"/>
   </ds:schemaRefs>

</xml_diff>